<commit_message>
fb-595.68.2: carry forward latest branch refresh
</commit_message>
<xml_diff>
--- a/courts/dc-circuit/court-of-appeals/opening-brief/usage/OUTPUT-opening-brief.docx
+++ b/courts/dc-circuit/court-of-appeals/opening-brief/usage/OUTPUT-opening-brief.docx
@@ -11,66 +11,30 @@
         <w:jc w:val="center"/>
       </w:pPr>
       <w:r>
-        <w:rPr>
-          <w:b/>
-          <w:bCs/>
-        </w:rPr>
         <w:t xml:space="preserve">ORAL</w:t>
       </w:r>
       <w:r>
-        <w:rPr>
-          <w:b/>
-          <w:bCs/>
-        </w:rPr>
-        <w:t xml:space="preserve"> </w:t>
-      </w:r>
-      <w:r>
-        <w:rPr>
-          <w:b/>
-          <w:bCs/>
-        </w:rPr>
+        <w:t xml:space="preserve"> </w:t>
+      </w:r>
+      <w:r>
         <w:t xml:space="preserve">ARGUMENT</w:t>
       </w:r>
       <w:r>
-        <w:rPr>
-          <w:b/>
-          <w:bCs/>
-        </w:rPr>
-        <w:t xml:space="preserve"> </w:t>
-      </w:r>
-      <w:r>
-        <w:rPr>
-          <w:b/>
-          <w:bCs/>
-        </w:rPr>
+        <w:t xml:space="preserve"> </w:t>
+      </w:r>
+      <w:r>
         <w:t xml:space="preserve">NOT</w:t>
       </w:r>
       <w:r>
-        <w:rPr>
-          <w:b/>
-          <w:bCs/>
-        </w:rPr>
-        <w:t xml:space="preserve"> </w:t>
-      </w:r>
-      <w:r>
-        <w:rPr>
-          <w:b/>
-          <w:bCs/>
-        </w:rPr>
+        <w:t xml:space="preserve"> </w:t>
+      </w:r>
+      <w:r>
         <w:t xml:space="preserve">YET</w:t>
       </w:r>
       <w:r>
-        <w:rPr>
-          <w:b/>
-          <w:bCs/>
-        </w:rPr>
-        <w:t xml:space="preserve"> </w:t>
-      </w:r>
-      <w:r>
-        <w:rPr>
-          <w:b/>
-          <w:bCs/>
-        </w:rPr>
+        <w:t xml:space="preserve"> </w:t>
+      </w:r>
+      <w:r>
         <w:t xml:space="preserve">SCHEDULED</w:t>
       </w:r>
     </w:p>
@@ -78,14 +42,22 @@
       <w:pPr>
         <w:keepNext/>
         <w:keepLines/>
-        <w:spacing w:before="67" w:after="0" w:line="328" w:lineRule="exact"/>
+        <w:spacing w:before="107" w:after="0" w:line="328" w:lineRule="exact"/>
         <w:ind w:left="0" w:firstLine="0"/>
         <w:jc w:val="center"/>
       </w:pPr>
       <w:r>
+        <w:rPr>
+          <w:b/>
+          <w:bCs/>
+        </w:rPr>
         <w:t xml:space="preserve">No. </w:t>
       </w:r>
       <w:r>
+        <w:rPr>
+          <w:b/>
+          <w:bCs/>
+        </w:rPr>
         <w:t xml:space="preserve">25</w:t>
         <w:noBreakHyphen/>
         <w:t xml:space="preserve">5181</w:t>
@@ -95,7 +67,7 @@
       <w:pPr>
         <w:keepNext/>
         <w:keepLines/>
-        <w:spacing w:before="200" w:after="0" w:line="328" w:lineRule="exact"/>
+        <w:spacing w:before="240" w:after="0" w:line="328" w:lineRule="exact"/>
         <w:ind w:left="0" w:firstLine="0"/>
         <w:jc w:val="center"/>
       </w:pPr>
@@ -119,7 +91,7 @@
       <w:pPr>
         <w:keepNext/>
         <w:keepLines/>
-        <w:spacing w:before="224" w:after="0" w:line="328" w:lineRule="exact"/>
+        <w:spacing w:before="269" w:after="0" w:line="328" w:lineRule="exact"/>
         <w:ind w:left="0" w:firstLine="0"/>
         <w:jc w:val="center"/>
       </w:pPr>
@@ -257,7 +229,7 @@
       <w:pPr>
         <w:keepNext/>
         <w:keepLines/>
-        <w:spacing w:before="224" w:after="0" w:line="328" w:lineRule="exact"/>
+        <w:spacing w:before="269" w:after="0" w:line="328" w:lineRule="exact"/>
         <w:ind w:left="0" w:firstLine="0"/>
         <w:jc w:val="center"/>
       </w:pPr>
@@ -391,7 +363,7 @@
       <w:pPr>
         <w:keepNext/>
         <w:keepLines/>
-        <w:spacing w:before="280" w:after="0" w:line="328" w:lineRule="exact"/>
+        <w:spacing w:before="336" w:after="0" w:line="328" w:lineRule="exact"/>
         <w:ind w:left="0" w:firstLine="0"/>
         <w:jc w:val="center"/>
       </w:pPr>
@@ -699,7 +671,7 @@
           </w:tcPr>
           <w:p>
             <w:pPr>
-              <w:spacing w:before="280" w:after="0" w:line="328" w:lineRule="exact"/>
+              <w:spacing w:before="336" w:after="0" w:line="328" w:lineRule="exact"/>
               <w:ind w:left="0" w:firstLine="0"/>
             </w:pPr>
             <w:r>
@@ -745,52 +717,24 @@
               <w:ind w:left="0" w:firstLine="0"/>
             </w:pPr>
             <w:r>
-              <w:rPr>
-                <w:i/>
-                <w:iCs/>
-              </w:rPr>
               <w:t xml:space="preserve">Raise</w:t>
             </w:r>
             <w:r>
-              <w:rPr>
-                <w:i/>
-                <w:iCs/>
-              </w:rPr>
               <w:t xml:space="preserve"> </w:t>
             </w:r>
             <w:r>
-              <w:rPr>
-                <w:i/>
-                <w:iCs/>
-              </w:rPr>
               <w:t xml:space="preserve">the</w:t>
             </w:r>
             <w:r>
-              <w:rPr>
-                <w:i/>
-                <w:iCs/>
-              </w:rPr>
               <w:t xml:space="preserve"> </w:t>
             </w:r>
             <w:r>
-              <w:rPr>
-                <w:i/>
-                <w:iCs/>
-              </w:rPr>
               <w:t xml:space="preserve">Floor</w:t>
             </w:r>
             <w:r>
-              <w:rPr>
-                <w:i/>
-                <w:iCs/>
-              </w:rPr>
               <w:t xml:space="preserve"> </w:t>
             </w:r>
             <w:r>
-              <w:rPr>
-                <w:i/>
-                <w:iCs/>
-              </w:rPr>
               <w:t xml:space="preserve">Alliance</w:t>
             </w:r>
           </w:p>
@@ -800,80 +744,36 @@
               <w:ind w:left="0" w:firstLine="0"/>
             </w:pPr>
             <w:r>
-              <w:rPr>
-                <w:i/>
-                <w:iCs/>
-              </w:rPr>
               <w:t xml:space="preserve">1</w:t>
             </w:r>
             <w:r>
-              <w:rPr>
-                <w:i/>
-                <w:iCs/>
-              </w:rPr>
               <w:t xml:space="preserve"> </w:t>
             </w:r>
             <w:r>
-              <w:rPr>
-                <w:i/>
-                <w:iCs/>
-              </w:rPr>
               <w:t xml:space="preserve">N.</w:t>
             </w:r>
             <w:r>
-              <w:rPr>
-                <w:i/>
-                <w:iCs/>
-              </w:rPr>
               <w:t xml:space="preserve"> </w:t>
             </w:r>
             <w:r>
-              <w:rPr>
-                <w:i/>
-                <w:iCs/>
-              </w:rPr>
               <w:t xml:space="preserve">LaSalle</w:t>
             </w:r>
             <w:r>
-              <w:rPr>
-                <w:i/>
-                <w:iCs/>
-              </w:rPr>
               <w:t xml:space="preserve"> </w:t>
             </w:r>
             <w:r>
-              <w:rPr>
-                <w:i/>
-                <w:iCs/>
-              </w:rPr>
               <w:t xml:space="preserve">Street,</w:t>
             </w:r>
             <w:r>
-              <w:rPr>
-                <w:i/>
-                <w:iCs/>
-              </w:rPr>
               <w:t xml:space="preserve"> </w:t>
             </w:r>
             <w:r>
-              <w:rPr>
-                <w:i/>
-                <w:iCs/>
-              </w:rPr>
               <w:t xml:space="preserve">Suite</w:t>
             </w:r>
             <w:r>
-              <w:rPr>
-                <w:i/>
-                <w:iCs/>
-              </w:rPr>
               <w:t xml:space="preserve"> </w:t>
             </w:r>
             <w:r>
-              <w:rPr>
-                <w:i/>
-                <w:iCs/>
-              </w:rPr>
               <w:t xml:space="preserve">1275</w:t>
             </w:r>
           </w:p>
@@ -883,38 +783,18 @@
               <w:ind w:left="0" w:firstLine="0"/>
             </w:pPr>
             <w:r>
-              <w:rPr>
-                <w:i/>
-                <w:iCs/>
-              </w:rPr>
               <w:t xml:space="preserve">Chicago,</w:t>
             </w:r>
             <w:r>
-              <w:rPr>
-                <w:i/>
-                <w:iCs/>
-              </w:rPr>
               <w:t xml:space="preserve"> </w:t>
             </w:r>
             <w:r>
-              <w:rPr>
-                <w:i/>
-                <w:iCs/>
-              </w:rPr>
               <w:t xml:space="preserve">Illinois</w:t>
             </w:r>
             <w:r>
-              <w:rPr>
-                <w:i/>
-                <w:iCs/>
-              </w:rPr>
               <w:t xml:space="preserve"> </w:t>
             </w:r>
             <w:r>
-              <w:rPr>
-                <w:i/>
-                <w:iCs/>
-              </w:rPr>
               <w:t xml:space="preserve">60602</w:t>
             </w:r>
           </w:p>
@@ -924,24 +804,12 @@
               <w:ind w:left="0" w:firstLine="0"/>
             </w:pPr>
             <w:r>
-              <w:rPr>
-                <w:i/>
-                <w:iCs/>
-              </w:rPr>
               <w:t xml:space="preserve">(312)</w:t>
             </w:r>
             <w:r>
-              <w:rPr>
-                <w:i/>
-                <w:iCs/>
-              </w:rPr>
               <w:t xml:space="preserve"> </w:t>
             </w:r>
             <w:r>
-              <w:rPr>
-                <w:i/>
-                <w:iCs/>
-              </w:rPr>
               <w:t xml:space="preserve">795</w:t>
               <w:noBreakHyphen/>
               <w:t xml:space="preserve">9115</w:t>
@@ -958,7 +826,7 @@
           </w:tcPr>
           <w:p>
             <w:pPr>
-              <w:spacing w:before="280" w:after="0" w:line="328" w:lineRule="exact"/>
+              <w:spacing w:before="336" w:after="0" w:line="328" w:lineRule="exact"/>
               <w:ind w:left="0" w:firstLine="0"/>
             </w:pPr>
             <w:r>
@@ -1004,52 +872,24 @@
               <w:ind w:left="0" w:firstLine="0"/>
             </w:pPr>
             <w:r>
-              <w:rPr>
-                <w:i/>
-                <w:iCs/>
-              </w:rPr>
               <w:t xml:space="preserve">Public</w:t>
             </w:r>
             <w:r>
-              <w:rPr>
-                <w:i/>
-                <w:iCs/>
-              </w:rPr>
               <w:t xml:space="preserve"> </w:t>
             </w:r>
             <w:r>
-              <w:rPr>
-                <w:i/>
-                <w:iCs/>
-              </w:rPr>
               <w:t xml:space="preserve">Citizen</w:t>
             </w:r>
             <w:r>
-              <w:rPr>
-                <w:i/>
-                <w:iCs/>
-              </w:rPr>
               <w:t xml:space="preserve"> </w:t>
             </w:r>
             <w:r>
-              <w:rPr>
-                <w:i/>
-                <w:iCs/>
-              </w:rPr>
               <w:t xml:space="preserve">Litigation</w:t>
             </w:r>
             <w:r>
-              <w:rPr>
-                <w:i/>
-                <w:iCs/>
-              </w:rPr>
               <w:t xml:space="preserve"> </w:t>
             </w:r>
             <w:r>
-              <w:rPr>
-                <w:i/>
-                <w:iCs/>
-              </w:rPr>
               <w:t xml:space="preserve">Group</w:t>
             </w:r>
           </w:p>
@@ -1059,52 +899,24 @@
               <w:ind w:left="0" w:firstLine="0"/>
             </w:pPr>
             <w:r>
-              <w:rPr>
-                <w:i/>
-                <w:iCs/>
-              </w:rPr>
               <w:t xml:space="preserve">1600</w:t>
             </w:r>
             <w:r>
-              <w:rPr>
-                <w:i/>
-                <w:iCs/>
-              </w:rPr>
               <w:t xml:space="preserve"> </w:t>
             </w:r>
             <w:r>
-              <w:rPr>
-                <w:i/>
-                <w:iCs/>
-              </w:rPr>
               <w:t xml:space="preserve">20th</w:t>
             </w:r>
             <w:r>
-              <w:rPr>
-                <w:i/>
-                <w:iCs/>
-              </w:rPr>
               <w:t xml:space="preserve"> </w:t>
             </w:r>
             <w:r>
-              <w:rPr>
-                <w:i/>
-                <w:iCs/>
-              </w:rPr>
               <w:t xml:space="preserve">Street,</w:t>
             </w:r>
             <w:r>
-              <w:rPr>
-                <w:i/>
-                <w:iCs/>
-              </w:rPr>
               <w:t xml:space="preserve"> </w:t>
             </w:r>
             <w:r>
-              <w:rPr>
-                <w:i/>
-                <w:iCs/>
-              </w:rPr>
               <w:t xml:space="preserve">NW</w:t>
             </w:r>
           </w:p>
@@ -1114,38 +926,18 @@
               <w:ind w:left="0" w:firstLine="0"/>
             </w:pPr>
             <w:r>
-              <w:rPr>
-                <w:i/>
-                <w:iCs/>
-              </w:rPr>
               <w:t xml:space="preserve">Washington,</w:t>
             </w:r>
             <w:r>
-              <w:rPr>
-                <w:i/>
-                <w:iCs/>
-              </w:rPr>
               <w:t xml:space="preserve"> </w:t>
             </w:r>
             <w:r>
-              <w:rPr>
-                <w:i/>
-                <w:iCs/>
-              </w:rPr>
               <w:t xml:space="preserve">DC</w:t>
             </w:r>
             <w:r>
-              <w:rPr>
-                <w:i/>
-                <w:iCs/>
-              </w:rPr>
               <w:t xml:space="preserve"> </w:t>
             </w:r>
             <w:r>
-              <w:rPr>
-                <w:i/>
-                <w:iCs/>
-              </w:rPr>
               <w:t xml:space="preserve">20009</w:t>
             </w:r>
           </w:p>
@@ -1155,24 +947,12 @@
               <w:ind w:left="0" w:firstLine="0"/>
             </w:pPr>
             <w:r>
-              <w:rPr>
-                <w:i/>
-                <w:iCs/>
-              </w:rPr>
               <w:t xml:space="preserve">(202)</w:t>
             </w:r>
             <w:r>
-              <w:rPr>
-                <w:i/>
-                <w:iCs/>
-              </w:rPr>
               <w:t xml:space="preserve"> </w:t>
             </w:r>
             <w:r>
-              <w:rPr>
-                <w:i/>
-                <w:iCs/>
-              </w:rPr>
               <w:t xml:space="preserve">588</w:t>
               <w:noBreakHyphen/>
               <w:t xml:space="preserve">7733</w:t>
@@ -1184,10 +964,6 @@
               <w:ind w:left="0" w:firstLine="0"/>
             </w:pPr>
             <w:r>
-              <w:rPr>
-                <w:i/>
-                <w:iCs/>
-              </w:rPr>
               <w:t xml:space="preserve">njoshi@citizen.org</w:t>
             </w:r>
           </w:p>
@@ -1232,66 +1008,30 @@
               <w:ind w:left="0" w:firstLine="0"/>
             </w:pPr>
             <w:r>
-              <w:rPr>
-                <w:i/>
-                <w:iCs/>
-              </w:rPr>
               <w:t xml:space="preserve">George</w:t>
             </w:r>
             <w:r>
-              <w:rPr>
-                <w:i/>
-                <w:iCs/>
-              </w:rPr>
               <w:t xml:space="preserve"> </w:t>
             </w:r>
             <w:r>
-              <w:rPr>
-                <w:i/>
-                <w:iCs/>
-              </w:rPr>
               <w:t xml:space="preserve">Washington</w:t>
             </w:r>
             <w:r>
-              <w:rPr>
-                <w:i/>
-                <w:iCs/>
-              </w:rPr>
               <w:t xml:space="preserve"> </w:t>
             </w:r>
             <w:r>
-              <w:rPr>
-                <w:i/>
-                <w:iCs/>
-              </w:rPr>
               <w:t xml:space="preserve">University</w:t>
             </w:r>
             <w:r>
-              <w:rPr>
-                <w:i/>
-                <w:iCs/>
-              </w:rPr>
               <w:t xml:space="preserve"> </w:t>
             </w:r>
             <w:r>
-              <w:rPr>
-                <w:i/>
-                <w:iCs/>
-              </w:rPr>
               <w:t xml:space="preserve">Law</w:t>
             </w:r>
             <w:r>
-              <w:rPr>
-                <w:i/>
-                <w:iCs/>
-              </w:rPr>
               <w:t xml:space="preserve"> </w:t>
             </w:r>
             <w:r>
-              <w:rPr>
-                <w:i/>
-                <w:iCs/>
-              </w:rPr>
               <w:t xml:space="preserve">School</w:t>
             </w:r>
           </w:p>
@@ -1301,52 +1041,24 @@
               <w:ind w:left="0" w:firstLine="0"/>
             </w:pPr>
             <w:r>
-              <w:rPr>
-                <w:i/>
-                <w:iCs/>
-              </w:rPr>
               <w:t xml:space="preserve">2000</w:t>
             </w:r>
             <w:r>
-              <w:rPr>
-                <w:i/>
-                <w:iCs/>
-              </w:rPr>
               <w:t xml:space="preserve"> </w:t>
             </w:r>
             <w:r>
-              <w:rPr>
-                <w:i/>
-                <w:iCs/>
-              </w:rPr>
               <w:t xml:space="preserve">H</w:t>
             </w:r>
             <w:r>
-              <w:rPr>
-                <w:i/>
-                <w:iCs/>
-              </w:rPr>
               <w:t xml:space="preserve"> </w:t>
             </w:r>
             <w:r>
-              <w:rPr>
-                <w:i/>
-                <w:iCs/>
-              </w:rPr>
               <w:t xml:space="preserve">Street,</w:t>
             </w:r>
             <w:r>
-              <w:rPr>
-                <w:i/>
-                <w:iCs/>
-              </w:rPr>
               <w:t xml:space="preserve"> </w:t>
             </w:r>
             <w:r>
-              <w:rPr>
-                <w:i/>
-                <w:iCs/>
-              </w:rPr>
               <w:t xml:space="preserve">NW</w:t>
             </w:r>
           </w:p>
@@ -1356,38 +1068,18 @@
               <w:ind w:left="0" w:firstLine="0"/>
             </w:pPr>
             <w:r>
-              <w:rPr>
-                <w:i/>
-                <w:iCs/>
-              </w:rPr>
               <w:t xml:space="preserve">Washington,</w:t>
             </w:r>
             <w:r>
-              <w:rPr>
-                <w:i/>
-                <w:iCs/>
-              </w:rPr>
               <w:t xml:space="preserve"> </w:t>
             </w:r>
             <w:r>
-              <w:rPr>
-                <w:i/>
-                <w:iCs/>
-              </w:rPr>
               <w:t xml:space="preserve">DC</w:t>
             </w:r>
             <w:r>
-              <w:rPr>
-                <w:i/>
-                <w:iCs/>
-              </w:rPr>
               <w:t xml:space="preserve"> </w:t>
             </w:r>
             <w:r>
-              <w:rPr>
-                <w:i/>
-                <w:iCs/>
-              </w:rPr>
               <w:t xml:space="preserve">20052</w:t>
             </w:r>
           </w:p>
@@ -1397,24 +1089,12 @@
               <w:ind w:left="0" w:firstLine="0"/>
             </w:pPr>
             <w:r>
-              <w:rPr>
-                <w:i/>
-                <w:iCs/>
-              </w:rPr>
               <w:t xml:space="preserve">(202)</w:t>
             </w:r>
             <w:r>
-              <w:rPr>
-                <w:i/>
-                <w:iCs/>
-              </w:rPr>
               <w:t xml:space="preserve"> </w:t>
             </w:r>
             <w:r>
-              <w:rPr>
-                <w:i/>
-                <w:iCs/>
-              </w:rPr>
               <w:t xml:space="preserve">994</w:t>
               <w:noBreakHyphen/>
               <w:t xml:space="preserve">7120</w:t>
@@ -1439,7 +1119,7 @@
     </w:tbl>
     <w:p>
       <w:pPr>
-        <w:spacing w:before="280" w:after="0" w:line="328" w:lineRule="exact"/>
+        <w:spacing w:before="336" w:after="0" w:line="328" w:lineRule="exact"/>
         <w:ind w:left="0" w:firstLine="0"/>
       </w:pPr>
       <w:r>
@@ -6956,52 +6636,24 @@
         <w:ind w:left="4820" w:firstLine="0"/>
       </w:pPr>
       <w:r>
-        <w:rPr>
-          <w:i/>
-          <w:iCs/>
-        </w:rPr>
         <w:t xml:space="preserve">Public</w:t>
       </w:r>
       <w:r>
-        <w:rPr>
-          <w:i/>
-          <w:iCs/>
-        </w:rPr>
-        <w:t xml:space="preserve"> </w:t>
-      </w:r>
-      <w:r>
-        <w:rPr>
-          <w:i/>
-          <w:iCs/>
-        </w:rPr>
+        <w:t xml:space="preserve"> </w:t>
+      </w:r>
+      <w:r>
         <w:t xml:space="preserve">Citizen</w:t>
       </w:r>
       <w:r>
-        <w:rPr>
-          <w:i/>
-          <w:iCs/>
-        </w:rPr>
-        <w:t xml:space="preserve"> </w:t>
-      </w:r>
-      <w:r>
-        <w:rPr>
-          <w:i/>
-          <w:iCs/>
-        </w:rPr>
+        <w:t xml:space="preserve"> </w:t>
+      </w:r>
+      <w:r>
         <w:t xml:space="preserve">Litigation</w:t>
       </w:r>
       <w:r>
-        <w:rPr>
-          <w:i/>
-          <w:iCs/>
-        </w:rPr>
-        <w:t xml:space="preserve"> </w:t>
-      </w:r>
-      <w:r>
-        <w:rPr>
-          <w:i/>
-          <w:iCs/>
-        </w:rPr>
+        <w:t xml:space="preserve"> </w:t>
+      </w:r>
+      <w:r>
         <w:t xml:space="preserve">Group</w:t>
       </w:r>
     </w:p>
@@ -7013,52 +6665,24 @@
         <w:ind w:left="4820" w:firstLine="0"/>
       </w:pPr>
       <w:r>
-        <w:rPr>
-          <w:i/>
-          <w:iCs/>
-        </w:rPr>
         <w:t xml:space="preserve">1600</w:t>
       </w:r>
       <w:r>
-        <w:rPr>
-          <w:i/>
-          <w:iCs/>
-        </w:rPr>
-        <w:t xml:space="preserve"> </w:t>
-      </w:r>
-      <w:r>
-        <w:rPr>
-          <w:i/>
-          <w:iCs/>
-        </w:rPr>
+        <w:t xml:space="preserve"> </w:t>
+      </w:r>
+      <w:r>
         <w:t xml:space="preserve">20th</w:t>
       </w:r>
       <w:r>
-        <w:rPr>
-          <w:i/>
-          <w:iCs/>
-        </w:rPr>
-        <w:t xml:space="preserve"> </w:t>
-      </w:r>
-      <w:r>
-        <w:rPr>
-          <w:i/>
-          <w:iCs/>
-        </w:rPr>
+        <w:t xml:space="preserve"> </w:t>
+      </w:r>
+      <w:r>
         <w:t xml:space="preserve">Street,</w:t>
       </w:r>
       <w:r>
-        <w:rPr>
-          <w:i/>
-          <w:iCs/>
-        </w:rPr>
-        <w:t xml:space="preserve"> </w:t>
-      </w:r>
-      <w:r>
-        <w:rPr>
-          <w:i/>
-          <w:iCs/>
-        </w:rPr>
+        <w:t xml:space="preserve"> </w:t>
+      </w:r>
+      <w:r>
         <w:t xml:space="preserve">NW</w:t>
       </w:r>
     </w:p>
@@ -7070,38 +6694,18 @@
         <w:ind w:left="4820" w:firstLine="0"/>
       </w:pPr>
       <w:r>
-        <w:rPr>
-          <w:i/>
-          <w:iCs/>
-        </w:rPr>
         <w:t xml:space="preserve">Washington,</w:t>
       </w:r>
       <w:r>
-        <w:rPr>
-          <w:i/>
-          <w:iCs/>
-        </w:rPr>
-        <w:t xml:space="preserve"> </w:t>
-      </w:r>
-      <w:r>
-        <w:rPr>
-          <w:i/>
-          <w:iCs/>
-        </w:rPr>
+        <w:t xml:space="preserve"> </w:t>
+      </w:r>
+      <w:r>
         <w:t xml:space="preserve">DC</w:t>
       </w:r>
       <w:r>
-        <w:rPr>
-          <w:i/>
-          <w:iCs/>
-        </w:rPr>
-        <w:t xml:space="preserve"> </w:t>
-      </w:r>
-      <w:r>
-        <w:rPr>
-          <w:i/>
-          <w:iCs/>
-        </w:rPr>
+        <w:t xml:space="preserve"> </w:t>
+      </w:r>
+      <w:r>
         <w:t xml:space="preserve">20009</w:t>
       </w:r>
     </w:p>
@@ -7113,24 +6717,12 @@
         <w:ind w:left="4820" w:firstLine="0"/>
       </w:pPr>
       <w:r>
-        <w:rPr>
-          <w:i/>
-          <w:iCs/>
-        </w:rPr>
         <w:t xml:space="preserve">(202)</w:t>
       </w:r>
       <w:r>
-        <w:rPr>
-          <w:i/>
-          <w:iCs/>
-        </w:rPr>
-        <w:t xml:space="preserve"> </w:t>
-      </w:r>
-      <w:r>
-        <w:rPr>
-          <w:i/>
-          <w:iCs/>
-        </w:rPr>
+        <w:t xml:space="preserve"> </w:t>
+      </w:r>
+      <w:r>
         <w:t xml:space="preserve">588</w:t>
         <w:noBreakHyphen/>
         <w:t xml:space="preserve">7733</w:t>
@@ -7144,10 +6736,6 @@
         <w:ind w:left="4820" w:firstLine="0"/>
       </w:pPr>
       <w:r>
-        <w:rPr>
-          <w:i/>
-          <w:iCs/>
-        </w:rPr>
         <w:t xml:space="preserve">njoshi@citizen.org</w:t>
       </w:r>
     </w:p>
@@ -7158,38 +6746,18 @@
         <w:ind w:left="4820" w:firstLine="0"/>
       </w:pPr>
       <w:r>
-        <w:rPr>
-          <w:i/>
-          <w:iCs/>
-        </w:rPr>
         <w:t xml:space="preserve">Counsel</w:t>
       </w:r>
       <w:r>
-        <w:rPr>
-          <w:i/>
-          <w:iCs/>
-        </w:rPr>
-        <w:t xml:space="preserve"> </w:t>
-      </w:r>
-      <w:r>
-        <w:rPr>
-          <w:i/>
-          <w:iCs/>
-        </w:rPr>
+        <w:t xml:space="preserve"> </w:t>
+      </w:r>
+      <w:r>
         <w:t xml:space="preserve">for</w:t>
       </w:r>
       <w:r>
-        <w:rPr>
-          <w:i/>
-          <w:iCs/>
-        </w:rPr>
-        <w:t xml:space="preserve"> </w:t>
-      </w:r>
-      <w:r>
-        <w:rPr>
-          <w:i/>
-          <w:iCs/>
-        </w:rPr>
+        <w:t xml:space="preserve"> </w:t>
+      </w:r>
+      <w:r>
         <w:t xml:space="preserve">Plaintif⁠fs-Appellants</w:t>
       </w:r>
     </w:p>

</xml_diff>